<commit_message>
Update Lab02 and Lab03 documents and add Lab05
</commit_message>
<xml_diff>
--- a/Lab02/1-docs/Lab02_Group07_Report.docx
+++ b/Lab02/1-docs/Lab02_Group07_Report.docx
@@ -80,6 +80,16 @@
           <w:lang w:bidi="th-TH"/>
         </w:rPr>
         <w:t xml:space="preserve"> จัดทำโดย</w:t>
+      </w:r>
+      <w:r>
+        <w:rPr>
+          <w:rFonts w:hint="cs"/>
+          <w:sz w:val="32"/>
+          <w:szCs w:val="32"/>
+          <w:cs/>
+          <w:lang w:bidi="th-TH"/>
+        </w:rPr>
+        <w:t xml:space="preserve"> </w:t>
       </w:r>
       <w:r>
         <w:rPr>
@@ -1418,8 +1428,18 @@
                 <w:color w:val="000000" w:themeColor="text1"/>
                 <w:szCs w:val="28"/>
               </w:rPr>
-              <w:t>Latency enter</w:t>
+              <w:t xml:space="preserve">Latency </w:t>
             </w:r>
+            <w:proofErr w:type="gramStart"/>
+            <w:r>
+              <w:rPr>
+                <w:b/>
+                <w:color w:val="000000" w:themeColor="text1"/>
+                <w:szCs w:val="28"/>
+              </w:rPr>
+              <w:t>enter</w:t>
+            </w:r>
+            <w:proofErr w:type="gramEnd"/>
             <w:r>
               <w:rPr>
                 <w:b/>
@@ -1457,8 +1477,18 @@
                 <w:color w:val="000000" w:themeColor="text1"/>
                 <w:szCs w:val="28"/>
               </w:rPr>
-              <w:t>Latency exit</w:t>
+              <w:t xml:space="preserve">Latency </w:t>
             </w:r>
+            <w:proofErr w:type="gramStart"/>
+            <w:r>
+              <w:rPr>
+                <w:b/>
+                <w:color w:val="000000" w:themeColor="text1"/>
+                <w:szCs w:val="28"/>
+              </w:rPr>
+              <w:t>exit</w:t>
+            </w:r>
+            <w:proofErr w:type="gramEnd"/>
             <w:r>
               <w:rPr>
                 <w:b/>
@@ -3417,7 +3447,18 @@
                 <w:cs/>
                 <w:lang w:bidi="th-TH"/>
               </w:rPr>
-              <w:t xml:space="preserve">                                           </w:t>
+              <w:t xml:space="preserve">                                        </w:t>
+            </w:r>
+            <w:proofErr w:type="gramStart"/>
+            <w:r>
+              <w:rPr>
+                <w:rFonts w:hint="cs"/>
+                <w:sz w:val="32"/>
+                <w:szCs w:val="32"/>
+                <w:cs/>
+                <w:lang w:bidi="th-TH"/>
+              </w:rPr>
+              <w:t xml:space="preserve">   </w:t>
             </w:r>
             <w:r>
               <w:rPr>
@@ -3426,6 +3467,7 @@
               </w:rPr>
               <w:t>(</w:t>
             </w:r>
+            <w:proofErr w:type="gramEnd"/>
             <w:r>
               <w:rPr>
                 <w:sz w:val="32"/>

</xml_diff>